<commit_message>
marzo elmirador - brisas
</commit_message>
<xml_diff>
--- a/BRISAS/EXPENSAS/2026/MARZO/INFORME MARZO.docx
+++ b/BRISAS/EXPENSAS/2026/MARZO/INFORME MARZO.docx
@@ -50,15 +50,18 @@
         <w:pStyle w:val="NormalWeb"/>
       </w:pPr>
       <w:r>
-        <w:t xml:space="preserve">A fin de evitar malos entendidos, recordamos que el personal de espacios verdes (Pili, Juan y Marcelo) trabaja dentro del horario permitido en el barrio, de 8 a 17 </w:t>
-      </w:r>
-      <w:proofErr w:type="spellStart"/>
-      <w:r>
-        <w:t>hs</w:t>
-      </w:r>
-      <w:proofErr w:type="spellEnd"/>
-      <w:r>
-        <w:t>. Solicitamos no comprometerlos a extender su jornada en los lotes, ya que hacerlo constituye una infracción.</w:t>
+        <w:t>A fin de evitar malos entendidos, recordamos que el personal de espacios verdes (Pili, Juan y Marcelo) trabaja dentro del horario permitido en el barrio, de 8 a 17 hs. Solicitamos no comprometerlos a extender su jornada en los lotes, ya que hacerlo constituye una infracción.</w:t>
+      </w:r>
+    </w:p>
+    <w:p>
+      <w:pPr>
+        <w:pStyle w:val="NormalWeb"/>
+      </w:pPr>
+      <w:r>
+        <w:t>Por otro lado, se</w:t>
+      </w:r>
+      <w:r>
+        <w:t xml:space="preserve"> firmó contrato con Telecentro y próximamente se estará comunicando la fecha de inicio en la que la empresa comenzará a cablear con fibra óptica.</w:t>
       </w:r>
     </w:p>
     <w:p>
@@ -109,15 +112,7 @@
     <w:p/>
     <w:p>
       <w:r>
-        <w:t xml:space="preserve">Los esperamos el </w:t>
-      </w:r>
-      <w:proofErr w:type="spellStart"/>
-      <w:r>
-        <w:t>dia</w:t>
-      </w:r>
-      <w:proofErr w:type="spellEnd"/>
-      <w:r>
-        <w:t xml:space="preserve"> 16/04 a las 19hs</w:t>
+        <w:t>Los esperamos el dia 16/04 a las 19hs</w:t>
       </w:r>
     </w:p>
     <w:sectPr>

</xml_diff>